<commit_message>
Add proposal, schema with sample data and functionalities
</commit_message>
<xml_diff>
--- a/docs/ShopSphere_Project_Proposal.docx
+++ b/docs/ShopSphere_Project_Proposal.docx
@@ -287,7 +287,7 @@
           <w:sz w:val="22"/>
           <w:szCs w:val="22"/>
         </w:rPr>
-        <w:t xml:space="preserve">Implement the schema in a relational DBMS (e.g., MySQL / PostgreSQL) with appropriate primary keys, foreign keys, and constraints.</w:t>
+        <w:t xml:space="preserve">Implement the schema in Microsoft SQL Server, using SSMS, with appropriate primary keys, foreign keys, and constraints.</w:t>
       </w:r>
     </w:p>
     <w:p>
@@ -1671,7 +1671,7 @@
                 <w:sz w:val="20"/>
                 <w:szCs w:val="20"/>
               </w:rPr>
-              <w:t xml:space="preserve">OrderID (PK), CustomerID (FK), AddressID (FK), OrderDate, Status, TotalAmount</w:t>
+              <w:t xml:space="preserve">OrderID (PK), CustomerID (FK), AddressID (FK), CouponID (FK, nullable), OrderDate, Status, TotalAmount</w:t>
             </w:r>
           </w:p>
         </w:tc>
@@ -1993,7 +1993,7 @@
                 <w:sz w:val="20"/>
                 <w:szCs w:val="20"/>
               </w:rPr>
-              <w:t xml:space="preserve">Wishlist / WishlistItem</w:t>
+              <w:t xml:space="preserve">WishlistItem</w:t>
             </w:r>
           </w:p>
         </w:tc>
@@ -2017,7 +2017,7 @@
                 <w:sz w:val="20"/>
                 <w:szCs w:val="20"/>
               </w:rPr>
-              <w:t xml:space="preserve">Assoc. (M:N resolver)</w:t>
+              <w:t xml:space="preserve">Associative</w:t>
             </w:r>
           </w:p>
         </w:tc>
@@ -2634,7 +2634,7 @@
                 <w:sz w:val="20"/>
                 <w:szCs w:val="20"/>
               </w:rPr>
-              <w:t xml:space="preserve">Customer – Cart – ProductVariant</w:t>
+              <w:t xml:space="preserve">Customer – Cart</w:t>
             </w:r>
           </w:p>
         </w:tc>
@@ -2658,7 +2658,7 @@
                 <w:sz w:val="20"/>
                 <w:szCs w:val="20"/>
               </w:rPr>
-              <w:t xml:space="preserve">M : N via CartItem</w:t>
+              <w:t xml:space="preserve">1 : 1</w:t>
             </w:r>
           </w:p>
         </w:tc>
@@ -2682,7 +2682,7 @@
                 <w:sz w:val="20"/>
                 <w:szCs w:val="20"/>
               </w:rPr>
-              <w:t xml:space="preserve">Resolved by the CartItem associative entity.</w:t>
+              <w:t xml:space="preserve">Each customer has exactly one persistent cart, enforced by a unique constraint on Cart.CustomerID.</w:t>
             </w:r>
           </w:p>
         </w:tc>
@@ -2708,7 +2708,7 @@
                 <w:sz w:val="20"/>
                 <w:szCs w:val="20"/>
               </w:rPr>
-              <w:t xml:space="preserve">Customer – Order</w:t>
+              <w:t xml:space="preserve">Cart – ProductVariant</w:t>
             </w:r>
           </w:p>
         </w:tc>
@@ -2732,7 +2732,7 @@
                 <w:sz w:val="20"/>
                 <w:szCs w:val="20"/>
               </w:rPr>
-              <w:t xml:space="preserve">1 : N</w:t>
+              <w:t xml:space="preserve">M : N via CartItem</w:t>
             </w:r>
           </w:p>
         </w:tc>
@@ -2756,7 +2756,7 @@
                 <w:sz w:val="20"/>
                 <w:szCs w:val="20"/>
               </w:rPr>
-              <w:t xml:space="preserve">A customer places many orders over time.</w:t>
+              <w:t xml:space="preserve">Resolved by the CartItem associative entity.</w:t>
             </w:r>
           </w:p>
         </w:tc>
@@ -2782,7 +2782,7 @@
                 <w:sz w:val="20"/>
                 <w:szCs w:val="20"/>
               </w:rPr>
-              <w:t xml:space="preserve">Order – ProductVariant</w:t>
+              <w:t xml:space="preserve">Customer – Order</w:t>
             </w:r>
           </w:p>
         </w:tc>
@@ -2806,7 +2806,7 @@
                 <w:sz w:val="20"/>
                 <w:szCs w:val="20"/>
               </w:rPr>
-              <w:t xml:space="preserve">M : N via OrderItem</w:t>
+              <w:t xml:space="preserve">1 : N</w:t>
             </w:r>
           </w:p>
         </w:tc>
@@ -2830,7 +2830,7 @@
                 <w:sz w:val="20"/>
                 <w:szCs w:val="20"/>
               </w:rPr>
-              <w:t xml:space="preserve">Resolved by the OrderItem associative entity.</w:t>
+              <w:t xml:space="preserve">A customer places many orders over time.</w:t>
             </w:r>
           </w:p>
         </w:tc>
@@ -2856,7 +2856,7 @@
                 <w:sz w:val="20"/>
                 <w:szCs w:val="20"/>
               </w:rPr>
-              <w:t xml:space="preserve">Order – Payment</w:t>
+              <w:t xml:space="preserve">Order – ProductVariant</w:t>
             </w:r>
           </w:p>
         </w:tc>
@@ -2880,7 +2880,7 @@
                 <w:sz w:val="20"/>
                 <w:szCs w:val="20"/>
               </w:rPr>
-              <w:t xml:space="preserve">1 : 1 (or 1:N for retries)</w:t>
+              <w:t xml:space="preserve">M : N via OrderItem</w:t>
             </w:r>
           </w:p>
         </w:tc>
@@ -2904,7 +2904,7 @@
                 <w:sz w:val="20"/>
                 <w:szCs w:val="20"/>
               </w:rPr>
-              <w:t xml:space="preserve">One primary payment record per order, extensible to installments.</w:t>
+              <w:t xml:space="preserve">Resolved by the OrderItem associative entity.</w:t>
             </w:r>
           </w:p>
         </w:tc>
@@ -2930,7 +2930,7 @@
                 <w:sz w:val="20"/>
                 <w:szCs w:val="20"/>
               </w:rPr>
-              <w:t xml:space="preserve">Order – Shipment</w:t>
+              <w:t xml:space="preserve">Order – Payment</w:t>
             </w:r>
           </w:p>
         </w:tc>
@@ -2954,7 +2954,7 @@
                 <w:sz w:val="20"/>
                 <w:szCs w:val="20"/>
               </w:rPr>
-              <w:t xml:space="preserve">1 : 1</w:t>
+              <w:t xml:space="preserve">1 : N</w:t>
             </w:r>
           </w:p>
         </w:tc>
@@ -2978,7 +2978,7 @@
                 <w:sz w:val="20"/>
                 <w:szCs w:val="20"/>
               </w:rPr>
-              <w:t xml:space="preserve">One shipment record tracks fulfillment status.</w:t>
+              <w:t xml:space="preserve">An order may have multiple payment records over time (e.g., a failed attempt followed by a successful retry).</w:t>
             </w:r>
           </w:p>
         </w:tc>
@@ -3004,7 +3004,7 @@
                 <w:sz w:val="20"/>
                 <w:szCs w:val="20"/>
               </w:rPr>
-              <w:t xml:space="preserve">Customer – Product (Review)</w:t>
+              <w:t xml:space="preserve">Order – Shipment</w:t>
             </w:r>
           </w:p>
         </w:tc>
@@ -3028,7 +3028,7 @@
                 <w:sz w:val="20"/>
                 <w:szCs w:val="20"/>
               </w:rPr>
-              <w:t xml:space="preserve">M : N via Review</w:t>
+              <w:t xml:space="preserve">1 : 1</w:t>
             </w:r>
           </w:p>
         </w:tc>
@@ -3052,7 +3052,7 @@
                 <w:sz w:val="20"/>
                 <w:szCs w:val="20"/>
               </w:rPr>
-              <w:t xml:space="preserve">A customer reviews a product at most once (unique constraint).</w:t>
+              <w:t xml:space="preserve">One shipment record tracks fulfillment status, enforced by a unique constraint on Shipment.OrderID.</w:t>
             </w:r>
           </w:p>
         </w:tc>
@@ -3078,7 +3078,7 @@
                 <w:sz w:val="20"/>
                 <w:szCs w:val="20"/>
               </w:rPr>
-              <w:t xml:space="preserve">Customer – Product (Wishlist)</w:t>
+              <w:t xml:space="preserve">Customer – Product (Review)</w:t>
             </w:r>
           </w:p>
         </w:tc>
@@ -3102,7 +3102,7 @@
                 <w:sz w:val="20"/>
                 <w:szCs w:val="20"/>
               </w:rPr>
-              <w:t xml:space="preserve">M : N via WishlistItem</w:t>
+              <w:t xml:space="preserve">M : N via Review</w:t>
             </w:r>
           </w:p>
         </w:tc>
@@ -3126,7 +3126,7 @@
                 <w:sz w:val="20"/>
                 <w:szCs w:val="20"/>
               </w:rPr>
-              <w:t xml:space="preserve">Resolved by an associative entity.</w:t>
+              <w:t xml:space="preserve">A customer reviews a product at most once (unique constraint).</w:t>
             </w:r>
           </w:p>
         </w:tc>
@@ -3152,7 +3152,7 @@
                 <w:sz w:val="20"/>
                 <w:szCs w:val="20"/>
               </w:rPr>
-              <w:t xml:space="preserve">Order – Coupon</w:t>
+              <w:t xml:space="preserve">Customer – Product (Wishlist)</w:t>
             </w:r>
           </w:p>
         </w:tc>
@@ -3176,7 +3176,7 @@
                 <w:sz w:val="20"/>
                 <w:szCs w:val="20"/>
               </w:rPr>
-              <w:t xml:space="preserve">M : N via OrderCoupon</w:t>
+              <w:t xml:space="preserve">M : N via WishlistItem</w:t>
             </w:r>
           </w:p>
         </w:tc>
@@ -3200,7 +3200,81 @@
                 <w:sz w:val="20"/>
                 <w:szCs w:val="20"/>
               </w:rPr>
-              <w:t xml:space="preserve">Supports future multi-coupon stacking; typically 0 or 1 per order.</w:t>
+              <w:t xml:space="preserve">Resolved by an associative entity.</w:t>
+            </w:r>
+          </w:p>
+        </w:tc>
+      </w:tr>
+      <w:tr>
+        <w:tc>
+          <w:tcPr>
+            <w:tcW w:type="dxa" w:w="3300"/>
+            <w:shd w:fill="EAF1F8" w:val="clear"/>
+            <w:tcMar>
+              <w:top w:type="dxa" w:w="80"/>
+              <w:left w:type="dxa" w:w="100"/>
+              <w:bottom w:type="dxa" w:w="80"/>
+              <w:right w:type="dxa" w:w="100"/>
+            </w:tcMar>
+          </w:tcPr>
+          <w:p>
+            <w:r>
+              <w:rPr>
+                <w:b w:val="false"/>
+                <w:bCs w:val="false"/>
+                <w:color w:val="000000"/>
+                <w:sz w:val="20"/>
+                <w:szCs w:val="20"/>
+              </w:rPr>
+              <w:t xml:space="preserve">Coupon – Order</w:t>
+            </w:r>
+          </w:p>
+        </w:tc>
+        <w:tc>
+          <w:tcPr>
+            <w:tcW w:type="dxa" w:w="1800"/>
+            <w:shd w:fill="EAF1F8" w:val="clear"/>
+            <w:tcMar>
+              <w:top w:type="dxa" w:w="80"/>
+              <w:left w:type="dxa" w:w="100"/>
+              <w:bottom w:type="dxa" w:w="80"/>
+              <w:right w:type="dxa" w:w="100"/>
+            </w:tcMar>
+          </w:tcPr>
+          <w:p>
+            <w:r>
+              <w:rPr>
+                <w:b w:val="false"/>
+                <w:bCs w:val="false"/>
+                <w:color w:val="000000"/>
+                <w:sz w:val="20"/>
+                <w:szCs w:val="20"/>
+              </w:rPr>
+              <w:t xml:space="preserve">1 : N</w:t>
+            </w:r>
+          </w:p>
+        </w:tc>
+        <w:tc>
+          <w:tcPr>
+            <w:tcW w:type="dxa" w:w="3900"/>
+            <w:shd w:fill="EAF1F8" w:val="clear"/>
+            <w:tcMar>
+              <w:top w:type="dxa" w:w="80"/>
+              <w:left w:type="dxa" w:w="100"/>
+              <w:bottom w:type="dxa" w:w="80"/>
+              <w:right w:type="dxa" w:w="100"/>
+            </w:tcMar>
+          </w:tcPr>
+          <w:p>
+            <w:r>
+              <w:rPr>
+                <w:b w:val="false"/>
+                <w:bCs w:val="false"/>
+                <w:color w:val="000000"/>
+                <w:sz w:val="20"/>
+                <w:szCs w:val="20"/>
+              </w:rPr>
+              <w:t xml:space="preserve">A coupon code can be used on many orders; an order carries at most one coupon (nullable CouponID on Order), so no junction table is needed.</w:t>
             </w:r>
           </w:p>
         </w:tc>
@@ -3245,7 +3319,7 @@
       <w:r>
         <w:drawing>
           <wp:inline distT="0" distB="0" distL="0" distR="0">
-            <wp:extent cx="6000750" cy="4724400"/>
+            <wp:extent cx="6000750" cy="4933950"/>
             <wp:effectExtent t="0" r="0" b="0" l="0"/>
             <wp:docPr id="1" name="" descr="" title=""/>
             <wp:cNvGraphicFramePr>
@@ -3270,7 +3344,7 @@
                   <pic:spPr bwMode="auto">
                     <a:xfrm>
                       <a:off x="0" y="0"/>
-                      <a:ext cx="6000750" cy="4724400"/>
+                      <a:ext cx="6000750" cy="4933950"/>
                     </a:xfrm>
                     <a:prstGeom prst="rect">
                       <a:avLst/>
@@ -3968,7 +4042,7 @@
                 <w:sz w:val="20"/>
                 <w:szCs w:val="20"/>
               </w:rPr>
-              <w:t xml:space="preserve">CustomerID → Customer, AddressID → Address</w:t>
+              <w:t xml:space="preserve">CustomerID → Customer, AddressID → Address, CouponID → Coupon (nullable)</w:t>
             </w:r>
           </w:p>
         </w:tc>
@@ -4349,7 +4423,7 @@
           <w:sz w:val="22"/>
           <w:szCs w:val="22"/>
         </w:rPr>
-        <w:t xml:space="preserve">Data tier: a relational DBMS (MySQL or PostgreSQL) hosting the schema described in Sections 7–9, with transactions used for multi-step operations such as checkout.</w:t>
+        <w:t xml:space="preserve">Data tier: SQL Server hosting the schema described in Sections 7–9, with transactions used for multi-step operations such as checkout.</w:t>
       </w:r>
     </w:p>
     <w:p>
@@ -4380,7 +4454,7 @@
           <w:sz w:val="22"/>
           <w:szCs w:val="22"/>
         </w:rPr>
-        <w:t xml:space="preserve">The following representative queries will be implemented and included in the final submission to validate that the schema supports realistic reporting and application needs:</w:t>
+        <w:t xml:space="preserve">The following queries will be implemented and included in the final submission to show that the schema supports realistic reporting needs:</w:t>
       </w:r>
     </w:p>
     <w:p>
@@ -4397,7 +4471,7 @@
           <w:sz w:val="22"/>
           <w:szCs w:val="22"/>
         </w:rPr>
-        <w:t xml:space="preserve">Top-selling products: total quantity sold per product, ranked descending, over a given date range.</w:t>
+        <w:t xml:space="preserve">Top-selling products: total quantity sold per product.</w:t>
       </w:r>
     </w:p>
     <w:p>
@@ -4414,7 +4488,7 @@
           <w:sz w:val="22"/>
           <w:szCs w:val="22"/>
         </w:rPr>
-        <w:t xml:space="preserve">Customer lifetime value: total amount spent per customer across all completed orders.</w:t>
+        <w:t xml:space="preserve">Customer spending: total amount spent per customer.</w:t>
       </w:r>
     </w:p>
     <w:p>
@@ -4431,7 +4505,7 @@
           <w:sz w:val="22"/>
           <w:szCs w:val="22"/>
         </w:rPr>
-        <w:t xml:space="preserve">Low-stock alert: all product variants whose StockQty falls below a reorder threshold.</w:t>
+        <w:t xml:space="preserve">Low-stock alert: product variants with stock below a set threshold.</w:t>
       </w:r>
     </w:p>
     <w:p>
@@ -4448,7 +4522,7 @@
           <w:sz w:val="22"/>
           <w:szCs w:val="22"/>
         </w:rPr>
-        <w:t xml:space="preserve">Order detail view: a joined view of an order, its line items, payment status, and shipment status for a given OrderID.</w:t>
+        <w:t xml:space="preserve">Order detail view: an order's line items joined with product names.</w:t>
       </w:r>
     </w:p>
     <w:p>
@@ -4465,7 +4539,7 @@
           <w:sz w:val="22"/>
           <w:szCs w:val="22"/>
         </w:rPr>
-        <w:t xml:space="preserve">Monthly revenue report: total completed-order revenue grouped by month.</w:t>
+        <w:t xml:space="preserve">Monthly revenue: total order revenue grouped by month.</w:t>
       </w:r>
     </w:p>
     <w:p>
@@ -4482,7 +4556,7 @@
           <w:sz w:val="22"/>
           <w:szCs w:val="22"/>
         </w:rPr>
-        <w:t xml:space="preserve">Category performance: revenue and units sold rolled up by product category, including subcategories via the recursive Category relationship.</w:t>
+        <w:t xml:space="preserve">Category performance: revenue and units sold per product category.</w:t>
       </w:r>
     </w:p>
     <w:p>

</xml_diff>